<commit_message>
feat: add VASops pentest/perf work, refresh Aspecta and Prosoft, redesign toolbox and flows
</commit_message>
<xml_diff>
--- a/static/Filip_csupka_CV.docx
+++ b/static/Filip_csupka_CV.docx
@@ -99,7 +99,7 @@
           <w:i w:val="0"/>
           <w:sz w:val="20"/>
         </w:rPr>
-        <w:t>DevOps / SRE engineer focused on Kubernetes, OpenShift, GitOps and observability. Experienced with private-cloud OpenShift, AKS, Hetzner Kubernetes, ArgoCD, Helm and production platform reliability. I build platforms that stay boring in production, move quickly for developers, and remain documented enough for repeatable operations.</w:t>
+        <w:t>DevOps / SRE engineer focused on Kubernetes, OpenShift, GitOps and observability. Experienced with private-cloud OpenShift, AKS, Hetzner Kubernetes, ArgoCD, Helm and production platform reliability, plus pentesting and load testing of production platforms. I build platforms that stay boring in production, move quickly for developers, and remain documented enough for repeatable operations.</w:t>
       </w:r>
     </w:p>
     <w:p>
@@ -134,7 +134,7 @@
           <w:i w:val="0"/>
           <w:sz w:val="20"/>
         </w:rPr>
-        <w:t>Kubernetes, OpenShift, AKS, Helm, Kustomize, ArgoCD, GitLab CI/CD, GitHub Actions, Docker, Terraform, Ansible, Prometheus, Grafana, Loki, Tempo, Alloy, Kafka, PostgreSQL, MongoDB, AWS, Linux, Bash, Sealed Secrets, Operators, OLM</w:t>
+        <w:t>Kubernetes, OpenShift, AKS, Helm, Kustomize, ArgoCD, GitLab CI/CD, GitHub Actions, Docker, Terraform, Ansible, Prometheus, Grafana, Loki, Tempo, Alloy, Helmfile, Vault, Kyverno, ODF/Ceph, k6, nmap, Trivy, VictoriaMetrics, Kafka, PostgreSQL, MongoDB, AWS, Linux, Bash, Sealed Secrets, Operators, OLM</w:t>
       </w:r>
     </w:p>
     <w:p>
@@ -155,6 +155,115 @@
           <w:sz w:val="23"/>
         </w:rPr>
         <w:t>PROFESSIONAL EXPERIENCE</w:t>
+      </w:r>
+    </w:p>
+    <w:p>
+      <w:pPr>
+        <w:keepNext/>
+        <w:widowControl/>
+        <w:spacing w:before="80" w:after="20" w:line="240" w:lineRule="auto"/>
+      </w:pPr>
+      <w:r>
+        <w:rPr>
+          <w:rFonts w:ascii="Arial" w:hAnsi="Arial"/>
+          <w:b/>
+          <w:i w:val="0"/>
+          <w:sz w:val="21"/>
+        </w:rPr>
+        <w:t>Pentest &amp; Performance Testing Consultant</w:t>
+      </w:r>
+      <w:r>
+        <w:rPr>
+          <w:rFonts w:ascii="Arial" w:hAnsi="Arial"/>
+          <w:b w:val="0"/>
+          <w:i w:val="0"/>
+          <w:sz w:val="21"/>
+        </w:rPr>
+        <w:t xml:space="preserve">  |  VASops (consulting)</w:t>
+      </w:r>
+      <w:r>
+        <w:rPr>
+          <w:rFonts w:ascii="Arial" w:hAnsi="Arial"/>
+          <w:b w:val="0"/>
+          <w:i/>
+          <w:sz w:val="20"/>
+        </w:rPr>
+        <w:t xml:space="preserve">  |  Sep 2026 – Present</w:t>
+      </w:r>
+    </w:p>
+    <w:p>
+      <w:pPr>
+        <w:pStyle w:val="ListBullet"/>
+        <w:widowControl/>
+        <w:spacing w:before="0" w:after="20" w:line="259" w:lineRule="auto"/>
+        <w:ind w:left="259" w:hanging="173"/>
+      </w:pPr>
+      <w:r>
+        <w:rPr>
+          <w:rFonts w:ascii="Arial" w:hAnsi="Arial"/>
+          <w:sz w:val="20"/>
+        </w:rPr>
+        <w:t>Pentest of a public-sector media platform on private-cloud RKE2: recon, CDN and perimeter bypass, TLS, Kubernetes RBAC, Pod Security and quotas, container images, CI runner runtime, ingress, database layer and isolation between four environments.</w:t>
+      </w:r>
+    </w:p>
+    <w:p>
+      <w:pPr>
+        <w:pStyle w:val="ListBullet"/>
+        <w:widowControl/>
+        <w:spacing w:before="0" w:after="20" w:line="259" w:lineRule="auto"/>
+        <w:ind w:left="259" w:hanging="173"/>
+      </w:pPr>
+      <w:r>
+        <w:rPr>
+          <w:rFonts w:ascii="Arial" w:hAnsi="Arial"/>
+          <w:sz w:val="20"/>
+        </w:rPr>
+        <w:t>Delivered evidence-first reports: severity, reproducible evidence and remediation matched to the client's own IaC; customer summary in Czech, technical evidence in English.</w:t>
+      </w:r>
+    </w:p>
+    <w:p>
+      <w:pPr>
+        <w:pStyle w:val="ListBullet"/>
+        <w:widowControl/>
+        <w:spacing w:before="0" w:after="20" w:line="259" w:lineRule="auto"/>
+        <w:ind w:left="259" w:hanging="173"/>
+      </w:pPr>
+      <w:r>
+        <w:rPr>
+          <w:rFonts w:ascii="Arial" w:hAnsi="Arial"/>
+          <w:sz w:val="20"/>
+        </w:rPr>
+        <w:t>Built a disposable multi-VM k6 load rig on Hetzner (Terraform + Ansible) with metrics in a separate VictoriaMetrics, and calibrated it against a local sink before testing the client.</w:t>
+      </w:r>
+    </w:p>
+    <w:p>
+      <w:pPr>
+        <w:pStyle w:val="ListBullet"/>
+        <w:widowControl/>
+        <w:spacing w:before="0" w:after="20" w:line="259" w:lineRule="auto"/>
+        <w:ind w:left="259" w:hanging="173"/>
+      </w:pPr>
+      <w:r>
+        <w:rPr>
+          <w:rFonts w:ascii="Arial" w:hAnsi="Arial"/>
+          <w:sz w:val="20"/>
+        </w:rPr>
+        <w:t>Designed load scenarios from baseline and peak day through CDN-to-origin pass-through, spike and stress-to-failure to mixed readers/editors and push-notification surge.</w:t>
+      </w:r>
+    </w:p>
+    <w:p>
+      <w:pPr>
+        <w:pStyle w:val="ListBullet"/>
+        <w:widowControl/>
+        <w:spacing w:before="0" w:after="20" w:line="259" w:lineRule="auto"/>
+        <w:ind w:left="259" w:hanging="173"/>
+      </w:pPr>
+      <w:r>
+        <w:rPr>
+          <w:rFonts w:ascii="Arial" w:hAnsi="Arial"/>
+          <w:sz w:val="20"/>
+        </w:rPr>
+        <w:t>Wrote small Go tools (RBAC audit, TCP sweeper) and cross-checked scanners (Trivy, Grype) before trusting results.</w:t>
       </w:r>
     </w:p>
     <w:p>
@@ -203,7 +312,7 @@
           <w:rFonts w:ascii="Arial" w:hAnsi="Arial"/>
           <w:sz w:val="20"/>
         </w:rPr>
-        <w:t>Operate HUB/SPOKE private-cloud OpenShift clusters with focus on monitoring, configuration drift, incident response and production reliability.</w:t>
+        <w:t>Operate ACM hub/spoke OpenShift 4.18–4.20 on bare metal for a public-sector client across prod, QA and lab, with focus on monitoring, configuration drift, incident response and production reliability.</w:t>
       </w:r>
     </w:p>
     <w:p>
@@ -218,7 +327,7 @@
           <w:rFonts w:ascii="Arial" w:hAnsi="Arial"/>
           <w:sz w:val="20"/>
         </w:rPr>
-        <w:t>Manage core cluster infrastructure and operators through custom Helm charts instead of manual cluster-side configuration.</w:t>
+        <w:t>Maintain about 100 custom Helm charts for operators and cluster configuration; changes flow chart, Helmfile render per cluster, PR with render check (GitHub Actions), Argo CD app-of-apps.</w:t>
       </w:r>
     </w:p>
     <w:p>
@@ -233,7 +342,7 @@
           <w:rFonts w:ascii="Arial" w:hAnsi="Arial"/>
           <w:sz w:val="20"/>
         </w:rPr>
-        <w:t>Plan and validate OpenShift and operator lifecycle upgrades, including rollback preparation and pre-production lab verification.</w:t>
+        <w:t>Plan and run OpenShift and operator lifecycle upgrades through ACM policy and OLM approvals, mapping blockers and operator order before touching production.</w:t>
       </w:r>
     </w:p>
     <w:p>
@@ -248,7 +357,22 @@
           <w:rFonts w:ascii="Arial" w:hAnsi="Arial"/>
           <w:sz w:val="20"/>
         </w:rPr>
-        <w:t>Maintain GitLab CI/CD delivery patterns and runner tagging so workloads land on the correct executors and release paths stay predictable.</w:t>
+        <w:t>Run storage, backup and policy layers: ODF/Ceph, OADP, etcd backups, Kyverno, ACS, Compliance Operator, Vault with External Secrets.</w:t>
+      </w:r>
+    </w:p>
+    <w:p>
+      <w:pPr>
+        <w:pStyle w:val="ListBullet"/>
+        <w:widowControl/>
+        <w:spacing w:before="0" w:after="20" w:line="259" w:lineRule="auto"/>
+        <w:ind w:left="259" w:hanging="173"/>
+      </w:pPr>
+      <w:r>
+        <w:rPr>
+          <w:rFonts w:ascii="Arial" w:hAnsi="Arial"/>
+          <w:sz w:val="20"/>
+        </w:rPr>
+        <w:t>Run observability on Prometheus, Alertmanager, Loki, Tempo/OpenTelemetry and Thanos; root-caused incidents (operator upgrade deadlock, storage-induced node stall) and wrote the runbooks.</w:t>
       </w:r>
     </w:p>
     <w:p>
@@ -342,7 +466,22 @@
           <w:rFonts w:ascii="Arial" w:hAnsi="Arial"/>
           <w:sz w:val="20"/>
         </w:rPr>
-        <w:t>Troubleshot service connectivity, PostgreSQL, MongoDB, Kafka and tracing issues across teams in production environments.</w:t>
+        <w:t>Troubleshot service connectivity, PostgreSQL, MongoDB, Kafka-compatible (Redpanda) flows and tracing issues across teams in production environments.</w:t>
+      </w:r>
+    </w:p>
+    <w:p>
+      <w:pPr>
+        <w:pStyle w:val="ListBullet"/>
+        <w:widowControl/>
+        <w:spacing w:before="0" w:after="20" w:line="259" w:lineRule="auto"/>
+        <w:ind w:left="259" w:hanging="173"/>
+      </w:pPr>
+      <w:r>
+        <w:rPr>
+          <w:rFonts w:ascii="Arial" w:hAnsi="Arial"/>
+          <w:sz w:val="20"/>
+        </w:rPr>
+        <w:t>Resolved incidents such as blocked Kubernetes writes from fragmented etcd (sequential defrag with validation), a lost CDC replication slot and silently dropped alert delivery, each ending in a verified fix.</w:t>
       </w:r>
     </w:p>
     <w:p>

</xml_diff>